<commit_message>
Fix proposal duplication, consolidate to one poster, honest ECIB label
</commit_message>
<xml_diff>
--- a/docs/ForiFlow-Proposal-Final.docx
+++ b/docs/ForiFlow-Proposal-Final.docx
@@ -311,7 +311,7 @@
             </ns2:solidFill>
           </ns2:textFill>
         </ns0:rPr>
-        <ns0:t>Version 2.3</ns0:t>
+        <ns0:t>Version 2.4</ns0:t>
       </ns0:r>
     </ns0:p>
     <ns0:p ns2:paraId="5227BB90">
@@ -718,7 +718,7 @@
         </ns0:sectPr>
       </ns0:pPr>
       <ns0:r>
-        <ns0:t>Revision history. Version 1.0: original CUI proposal draft. Version 1.1: aligned datasets, AUC, UI, and EWS with the running prototype. Version 1.2: full API surface, SMOTE-in-CV, relative-ranking caveat. Version 2.0: complete product alignment. Version 2.1: served-artefact metrics restated to four decimals (CV 0.7758 +/- 0.0075); AUC ladder ceiling 0.7776 documented as not shipped; EWS described as rule-based rather than ensemble re-inference; Give Me Some Credit recorded as a consumer-credit proxy that is not production; SME census vintage and NPL citations clarified. Version 2.2: Docker/pilot database is PostgreSQL 16.6 with Alembic (0001_initial, 0002_users); on-premise JWT login (HS256, eight hours; roles admin and analyst share the scoring and EWS API); the first officer is created with python -m scripts.seed_admin after the backend is healthy; pytest still uses in-memory SQLite. Version 2.3: everyday Windows start is start.bat / start.ps1 (starts Docker Desktop if needed, no rebuild); API, dashboard, and Postgres are published on 127.0.0.1 only; unused intake fields carry an amber label; SHAP summary cards are rounded so they add to the displayed score; EWS filters are All / Active / Resolved; sidebar copy is on-premise explainability (no live ECIB, not SBP-certified), not 'SBP compliance mode'; live MVP click-through verified 5 September 2026.</ns0:t>
+        <ns0:t>Revision history. Version 1.0: original CUI proposal draft. Version 1.1: aligned datasets, AUC, UI, and EWS with the running prototype. Version 1.2: full API surface, SMOTE-in-CV, relative-ranking caveat. Version 2.0: complete product alignment. Version 2.1: served-artefact metrics restated to four decimals (CV 0.7758 +/- 0.0075); AUC ladder ceiling 0.7776 documented as not shipped; EWS described as rule-based rather than ensemble re-inference; Give Me Some Credit recorded as a consumer-credit proxy that is not production; SME census vintage and NPL citations clarified. Version 2.2: Docker/pilot database is PostgreSQL 16.6 with Alembic (0001_initial, 0002_users); on-premise JWT login (HS256, eight hours; roles admin and analyst share the scoring and EWS API); the first officer is created with python -m scripts.seed_admin after the backend is healthy; pytest still uses in-memory SQLite. Version 2.3: everyday Windows start is start.bat / start.ps1 (starts Docker Desktop if needed, no rebuild); API, dashboard, and Postgres are published on 127.0.0.1 only; unused intake fields carry an amber label; SHAP summary cards are rounded so they add to the displayed score; EWS filters are All / Active / Resolved; sidebar copy is on-premise explainability (no live ECIB, not SBP-certified), not 'SBP compliance mode'; live MVP click-through verified 5 September 2026. Version 2.4: collapsed a duplicated sentence in the SHAP waterfall description (FE-1); retired the duplicate in-app /poster marketing route in favor of one canonical printable A1 poster (docs/foriflow-poster.html); renamed the ml-served payment-history feature label from '(ECIB)' to '(officer-entered)' for consistency with the no-live-ECIB language used everywhere else; full backend test suite (105/105) reverified against a live PostgreSQL 16 instance and the trained ensemble on 18 September 2026.</ns0:t>
       </ns0:r>
     </ns0:p>
     <ns0:sdt>
@@ -5649,7 +5649,7 @@
           <ns0:szCs ns0:val="24"/>
           <ns0:lang ns0:val="en-US"/>
         </ns0:rPr>
-        <ns0:t>FE-1: After scoring, the officer sees a SHAP waterfall on the Credit Scoring result and can open the same explanation on the SHAP Reports page (/shap/{application_id}). The Applications table links to that page; it is a dedicated route, not an auto-opening modal. The chart is a horizontal waterfall from the model base value, with bars for risk-increasing and risk-reducing features, ending at the 0–100 score. The on-screen summary cards (base, positive, negative, final) are rounded so they add to the displayed score. The on-screen summary cards (base, positive, negative, final) are rounded so they add to the displayed score. The on-screen summary cards (base, positive, negative, final) are rounded so they add to the displayed score. The on-screen summary cards (base, positive, negative, final) are rounded so they add to the displayed score. Stored SHAP payloads support audit retrieval. The prototype is designed to support SBP-oriented explainability; it is not an SBP certification.</ns0:t>
+        <ns0:t>FE-1: After scoring, the officer sees a SHAP waterfall on the Credit Scoring result and can open the same explanation on the SHAP Reports page (/shap/{application_id}). The Applications table links to that page; it is a dedicated route, not an auto-opening modal. The chart is a horizontal waterfall from the model base value, with bars for risk-increasing and risk-reducing features, ending at the 0–100 score. The on-screen summary cards (base, positive, negative, final) are rounded so they add to the displayed score. Stored SHAP payloads support audit retrieval. The prototype is designed to support SBP-oriented explainability; it is not an SBP certification.</ns0:t>
       </ns0:r>
       <ns0:r>
         <ns0:rPr>
@@ -17742,7 +17742,7 @@
     </ns0:p>
     <ns0:p>
       <ns0:r>
-        <ns0:t>Plagiarism / originality report (Turnitin-style scan of the original FYPI draft): overall similarity 6% (internet sources 4%, student papers 6%, publications 0%). Versions 2.0-2.3 rewrote the body to match the implemented repository, measured AUCs, PostgreSQL, JWT login, start.bat, and the live officer UI. A fresh scan should be attached here before final submission if the committee requires it.</ns0:t>
+        <ns0:t>Plagiarism / originality report (Turnitin-style scan of the original FYPI draft): overall similarity 6% (internet sources 4%, student papers 6%, publications 0%). Versions 2.0-2.4 rewrote the body to match the implemented repository, measured AUCs, PostgreSQL, JWT login, start.bat, and the live officer UI. A fresh scan should be attached here before final submission if the committee requires it.</ns0:t>
       </ns0:r>
     </ns0:p>
     <ns0:bookmarkEnd ns0:id="73"/>

</xml_diff>

<commit_message>
Proposal: embed the recaptured 1.2.0 screenshots and the measured laptop latency
The four app screenshots in docs/ForiFlow-Proposal-Final.docx (dashboard,
scoring, SHAP, EWS) are replaced by the 26 September captures of the rebuilt
stack, cropped to the same 1600x841 frame so the layout does not move. The
latency statements now use the figure measured inside the backend container
on the development laptop (median 150 ms over 30 runs). CHANGELOG notes the
refreshed screenshots and proposal.

Co-Authored-By: Claude Opus 5.5 <noreply@anthropic.com>
Claude-Session: https://claude.ai/code/session_01NqdHcg62jAHxXwKBF9J1R1
</commit_message>
<xml_diff>
--- a/docs/ForiFlow-Proposal-Final.docx
+++ b/docs/ForiFlow-Proposal-Final.docx
@@ -3320,7 +3320,7 @@
           <ns0:szCs ns0:val="24"/>
           <ns0:lang ns0:eastAsia="zh-CN"/>
         </ns0:rPr>
-        <ns0:t>The solution is a containerised FastAPI REST backend with endpoints POST /auth/login, POST /score, GET /score/applications, GET /score/applications/{id}, GET/POST /explain/{id}, POST /ews/monitor, GET /ews/alerts, PATCH /ews/alerts/{id}/resolve, GET /ews/borrowers/{id}/history, GET /auth/me, GET/POST /auth/users, GET /health, and GET /, integrated with a React 18 dashboard. Training is python -m ml.train_real_model from backend/. SMOTE runs inside each StratifiedKFold split (5 folds, shuffle=True, random_state=42) so synthetic rows do not leak into validation. Pytest covers scoring, SHAP additivity, EWS alert contracts, and JWT login. There is no MLflow registry. Officers authenticate with on-premise JWT (HS256, eight-hour lifetime, roles admin and analyst). Both roles may score and monitor; only admin may resolve EWS alerts or list and create officer accounts, and the role is read from the database on every request. Served public-data results: AUC-ROC 0.7752 +/- 0.0073 (5-fold CV), hold-out AUC-ROC 0.7731, F1 0.546, Brier 0.185. AUC-ROC 0.85 and F1 0.80 are not current results and, on the three served features, are not reachable by further tree tuning (ladder ceiling 0.7776 +/- 0.0067). Scoring one applicant took about 230 ms on the development laptop with the earlier, larger forest; the constrained forest takes about 17 ms in the cloud test environment. Interventional TreeSHAP dominates the time. Repository: https://github.com/Idreesi8/ForiFlow.</ns0:t>
+        <ns0:t>The solution is a containerised FastAPI REST backend with endpoints POST /auth/login, POST /score, GET /score/applications, GET /score/applications/{id}, GET/POST /explain/{id}, POST /ews/monitor, GET /ews/alerts, PATCH /ews/alerts/{id}/resolve, GET /ews/borrowers/{id}/history, GET /auth/me, GET/POST /auth/users, GET /health, and GET /, integrated with a React 18 dashboard. Training is python -m ml.train_real_model from backend/. SMOTE runs inside each StratifiedKFold split (5 folds, shuffle=True, random_state=42) so synthetic rows do not leak into validation. Pytest covers scoring, SHAP additivity, EWS alert contracts, and JWT login. There is no MLflow registry. Officers authenticate with on-premise JWT (HS256, eight-hour lifetime, roles admin and analyst). Both roles may score and monitor; only admin may resolve EWS alerts or list and create officer accounts, and the role is read from the database on every request. Served public-data results: AUC-ROC 0.7752 +/- 0.0073 (5-fold CV), hold-out AUC-ROC 0.7731, F1 0.546, Brier 0.185. AUC-ROC 0.85 and F1 0.80 are not current results and, on the three served features, are not reachable by further tree tuning (ladder ceiling 0.7776 +/- 0.0067). Scoring one applicant took about 230 ms on the development laptop with the earlier, larger forest; the constrained forest takes about 150 ms (median of 30 runs inside the Docker container on the same laptop). Interventional TreeSHAP dominates the time. Repository: https://github.com/Idreesi8/ForiFlow.</ns0:t>
       </ns0:r>
     </ns0:p>
     <ns0:p>
@@ -16367,7 +16367,7 @@
                 <ns0:rFonts ns0:ascii="Times New Roman" ns0:hAnsi="Times New Roman"/>
                 <ns0:szCs ns0:val="24"/>
               </ns0:rPr>
-              <ns0:t>Interventional TreeSHAP on the ensemble takes about 17 ms (measured in the cloud test environment; the earlier, larger forest took about 230 ms on the development laptop) per applicant after warm start — acceptable for officer interactive use, not a high-frequency trading loop. Lin &amp; Wang (2025) confirmed SHAP stability across repeated XGBoost runs, validating this approach.</ns0:t>
+              <ns0:t>Interventional TreeSHAP on the ensemble takes about 150 ms (median of 30 runs inside the Docker container on the development laptop; the earlier, larger forest took about 230 ms) per applicant after warm start — acceptable for officer interactive use, not a high-frequency trading loop. Lin &amp; Wang (2025) confirmed SHAP stability across repeated XGBoost runs, validating this approach.</ns0:t>
             </ns0:r>
           </ns0:p>
         </ns0:tc>

</xml_diff>